<commit_message>
Update 19/02/2026 - 15:19
</commit_message>
<xml_diff>
--- a/paper/paper_gas_operability_v4.docx
+++ b/paper/paper_gas_operability_v4.docx
@@ -9785,7 +9785,23 @@
         <w:rPr>
           <w:lang w:val="en-US"/>
         </w:rPr>
-        <w:t>Table 7 presents the optimized operating point. The SLSQP solution achieves a sales revenue of 663.85 $/h, representing a 7.1% improvement over the best feasible point identified by LHS sampling (619.89 $/h). The optimizer drives the cold separator temperature to the lower bound of the AIS (−33.00 °C), maximizing liquid recovery and confirming the dominant role of this variable in revenue generation (|r| = 0.984). The deethaniser reboiler settles at 66.29 °C, keeping ethane in LPG at 12.00 mol%—precisely at the g₂ constraint boundary. The debutani</w:t>
+        <w:t>Table 7 presents the optimized operating point. The SLSQP solution achieves a sales revenue of 663.85 $/h, representing a marginal improvement of 0.15% over the best feasible point identified by LHS sampling (662.83 $/h). This narrow gap indicates that the LHS sampling with 2000 points provided near-optimal coverage of the feasible region, and that the objective function is relatively flat near the constraint boundaries.</w:t>
+      </w:r>
+    </w:p>
+    <w:p>
+      <w:pPr>
+        <w:spacing w:after="120" w:line="360" w:lineRule="auto"/>
+        <w:ind w:firstLine="706"/>
+        <w:jc w:val="both"/>
+        <w:rPr>
+          <w:lang w:val="en-US"/>
+        </w:rPr>
+      </w:pPr>
+      <w:r>
+        <w:rPr>
+          <w:lang w:val="en-US"/>
+        </w:rPr>
+        <w:t>The optimizer drives the cold separator temperature to the lower bound of the AIS (−33.00 °C), maximizing liquid recovery and confirming the dominant role of this variable in revenue generation (|r| = 0.984). The deethaniser reboiler settles at 66.29 °C, keeping ethane in LPG at 12.00 mol%—precisely at the g₂ constraint boundary. The debutani</w:t>
       </w:r>
       <w:r>
         <w:rPr>
@@ -10400,6 +10416,7 @@
                 <w:sz w:val="18"/>
                 <w:szCs w:val="18"/>
               </w:rPr>
+              <w:lastRenderedPageBreak/>
               <w:t>T_02_Reb (u₄)</w:t>
             </w:r>
           </w:p>
@@ -10910,7 +10927,6 @@
                 <w:sz w:val="18"/>
                 <w:szCs w:val="18"/>
               </w:rPr>
-              <w:lastRenderedPageBreak/>
               <w:t>LPG_C2</w:t>
             </w:r>
           </w:p>
@@ -11627,7 +11643,6 @@
     <w:p>
       <w:pPr>
         <w:spacing w:after="120" w:line="360" w:lineRule="auto"/>
-        <w:ind w:firstLine="706"/>
         <w:jc w:val="center"/>
         <w:rPr>
           <w:lang w:val="en-US"/>
@@ -11639,10 +11654,10 @@
           <w:lang w:val="en-US"/>
         </w:rPr>
         <w:drawing>
-          <wp:inline distT="0" distB="0" distL="0" distR="0" wp14:anchorId="65EF0BE1" wp14:editId="30B63105">
+          <wp:inline distT="0" distB="0" distL="0" distR="0" wp14:anchorId="1D9CE3EF" wp14:editId="2DB38C1A">
             <wp:extent cx="5233427" cy="4014224"/>
             <wp:effectExtent l="0" t="0" r="5715" b="5715"/>
-            <wp:docPr id="123826538" name="Picture 6"/>
+            <wp:docPr id="1393432733" name="Picture 5"/>
             <wp:cNvGraphicFramePr>
               <a:graphicFrameLocks xmlns:a="http://schemas.openxmlformats.org/drawingml/2006/main" noChangeAspect="1"/>
             </wp:cNvGraphicFramePr>
@@ -11650,7 +11665,7 @@
               <a:graphicData uri="http://schemas.openxmlformats.org/drawingml/2006/picture">
                 <pic:pic xmlns:pic="http://schemas.openxmlformats.org/drawingml/2006/picture">
                   <pic:nvPicPr>
-                    <pic:cNvPr id="123826538" name="Picture 123826538"/>
+                    <pic:cNvPr id="1393432733" name="Picture 1393432733"/>
                     <pic:cNvPicPr/>
                   </pic:nvPicPr>
                   <pic:blipFill>
@@ -11724,7 +11739,14 @@
         <w:rPr>
           <w:lang w:val="en-US"/>
         </w:rPr>
-        <w:t>This dual-active configuration means the optimal operating point is inherently fragile to operational perturbations—any disturbance that increases either ethane in LPG or the RVP of NG would immediately push the plant into constraint violation. This fragility, invisible to single-point optimization, is precisely the kind of insight that operability analysis provides.</w:t>
+        <w:t xml:space="preserve">This dual-active configuration means the optimal operating point is inherently </w:t>
+      </w:r>
+      <w:r>
+        <w:rPr>
+          <w:lang w:val="en-US"/>
+        </w:rPr>
+        <w:lastRenderedPageBreak/>
+        <w:t>fragile to operational perturbations—any disturbance that increases either ethane in LPG or the RVP of NG would immediately push the plant into constraint violation. This fragility, invisible to single-point optimization, is precisely the kind of insight that operability analysis provides.</w:t>
       </w:r>
     </w:p>
     <w:p>
@@ -11740,7 +11762,6 @@
         <w:rPr>
           <w:lang w:val="en-US"/>
         </w:rPr>
-        <w:lastRenderedPageBreak/>
         <w:t>The complementarity between the two approaches is noteworthy: LHS-based operability mapping reveals that only 14.1% of the operating space is feasible and identifies the LPG_C5–NG_RVP coupling as the structural bottleneck, while SLSQP optimization pinpoints the revenue-maximizing point within this constrained envelope. Together, they provide both a system-level understanding of the feasible landscape and a precise, actionable operating target.</w:t>
       </w:r>
     </w:p>
@@ -11864,7 +11885,14 @@
         <w:rPr>
           <w:lang w:val="en-US"/>
         </w:rPr>
-        <w:t>The use of DWSIM as the process simulator, rather than commercial alternatives such as Aspen Plus, HYSYS, or UniSim, is a deliberate methodological choice. While commercial simulators offer broader thermodynamic libraries and validated unit operation models, the open-source nature of DWSIM enables complete reproducibility: any researcher can download the simulation file, replicate the LHS sampling, and verify the reported OI without license restrictions.</w:t>
+        <w:t xml:space="preserve">The use of DWSIM as the process simulator, rather than commercial alternatives such as Aspen Plus, HYSYS, or UniSim, is a deliberate methodological choice. While commercial simulators offer </w:t>
+      </w:r>
+      <w:r>
+        <w:rPr>
+          <w:lang w:val="en-US"/>
+        </w:rPr>
+        <w:lastRenderedPageBreak/>
+        <w:t>broader thermodynamic libraries and validated unit operation models, the open-source nature of DWSIM enables complete reproducibility: any researcher can download the simulation file, replicate the LHS sampling, and verify the reported OI without license restrictions.</w:t>
       </w:r>
     </w:p>
     <w:p>
@@ -11879,7 +11907,6 @@
         <w:rPr>
           <w:lang w:val="en-US"/>
         </w:rPr>
-        <w:lastRenderedPageBreak/>
         <w:t>5. Limitations and Future Work</w:t>
       </w:r>
     </w:p>
@@ -12039,6 +12066,7 @@
         <w:rPr>
           <w:lang w:val="en-US"/>
         </w:rPr>
+        <w:lastRenderedPageBreak/>
         <w:t>(3) A strong inverse coupling between C₅₊ content in LPG and RVP of Natural Gasoline (r = −0.650) creates a fundamental thermodynamic trade-off that compresses the feasible envelope below what independent constraint analysis would predict.</w:t>
       </w:r>
     </w:p>
@@ -12055,7 +12083,6 @@
         <w:rPr>
           <w:lang w:val="en-US"/>
         </w:rPr>
-        <w:lastRenderedPageBreak/>
         <w:t>(4) The cold separator temperature dominates revenue generation (|r| = 0.984 with revenue), providing a clear, single-variable lever for economic optimization. The deethaniser and debutani</w:t>
       </w:r>
       <w:r>
@@ -12257,7 +12284,6 @@
         <w:rPr>
           <w:lang w:val="en-US"/>
         </w:rPr>
-        <w:lastRenderedPageBreak/>
         <w:t xml:space="preserve">The datasets, simulation files, and analysis scripts are available at: </w:t>
       </w:r>
       <w:hyperlink r:id="rId18" w:history="1">
@@ -13023,7 +13049,7 @@
 <w15:commentsEx xmlns:wpc="http://schemas.microsoft.com/office/word/2010/wordprocessingCanvas" xmlns:cx="http://schemas.microsoft.com/office/drawing/2014/chartex" xmlns:cx1="http://schemas.microsoft.com/office/drawing/2015/9/8/chartex" xmlns:cx2="http://schemas.microsoft.com/office/drawing/2015/10/21/chartex" xmlns:cx3="http://schemas.microsoft.com/office/drawing/2016/5/9/chartex" xmlns:cx4="http://schemas.microsoft.com/office/drawing/2016/5/10/chartex" xmlns:cx5="http://schemas.microsoft.com/office/drawing/2016/5/11/chartex" xmlns:cx6="http://schemas.microsoft.com/office/drawing/2016/5/12/chartex" xmlns:cx7="http://schemas.microsoft.com/office/drawing/2016/5/13/chartex" xmlns:cx8="http://schemas.microsoft.com/office/drawing/2016/5/14/chartex" xmlns:mc="http://schemas.openxmlformats.org/markup-compatibility/2006" xmlns:aink="http://schemas.microsoft.com/office/drawing/2016/ink" xmlns:am3d="http://schemas.microsoft.com/office/drawing/2017/model3d" xmlns:o="urn:schemas-microsoft-com:office:office" xmlns:oel="http://schemas.microsoft.com/office/2019/extlst" xmlns:r="http://schemas.openxmlformats.org/officeDocument/2006/relationships" xmlns:m="http://schemas.openxmlformats.org/officeDocument/2006/math" xmlns:v="urn:schemas-microsoft-com:vml" xmlns:wp14="http://schemas.microsoft.com/office/word/2010/wordprocessingDrawing" xmlns:wp="http://schemas.openxmlformats.org/drawingml/2006/wordprocessingDrawing" xmlns:w10="urn:schemas-microsoft-com:office:word" xmlns:w="http://schemas.openxmlformats.org/wordprocessingml/2006/main" xmlns:w14="http://schemas.microsoft.com/office/word/2010/wordml" xmlns:w15="http://schemas.microsoft.com/office/word/2012/wordml" xmlns:w16cex="http://schemas.microsoft.com/office/word/2018/wordml/cex" xmlns:w16cid="http://schemas.microsoft.com/office/word/2016/wordml/cid" xmlns:w16="http://schemas.microsoft.com/office/word/2018/wordml" xmlns:w16du="http://schemas.microsoft.com/office/word/2023/wordml/word16du" xmlns:w16sdtdh="http://schemas.microsoft.com/office/word/2020/wordml/sdtdatahash" xmlns:w16sdtfl="http://schemas.microsoft.com/office/word/2024/wordml/sdtformatlock" xmlns:w16se="http://schemas.microsoft.com/office/word/2015/wordml/symex" xmlns:wpg="http://schemas.microsoft.com/office/word/2010/wordprocessingGroup" xmlns:wpi="http://schemas.microsoft.com/office/word/2010/wordprocessingInk" xmlns:wne="http://schemas.microsoft.com/office/word/2006/wordml" xmlns:wps="http://schemas.microsoft.com/office/word/2010/wordprocessingShape" mc:Ignorable="w14 w15 w16se w16cid w16 w16cex w16sdtdh w16sdtfl w16du wp14">
   <w15:commentEx w15:paraId="6B0899BC" w15:done="1"/>
   <w15:commentEx w15:paraId="5D76174A" w15:done="1"/>
-  <w15:commentEx w15:paraId="1B1A0658" w15:done="0"/>
+  <w15:commentEx w15:paraId="1B1A0658" w15:done="1"/>
 </w15:commentsEx>
 </file>
 

</xml_diff>